<commit_message>
Dokumentum írása + képek csere
</commit_message>
<xml_diff>
--- a/Felhasználóisablon.docx
+++ b/Felhasználóisablon.docx
@@ -1864,6 +1864,7 @@
       <w:bookmarkEnd w:id="4"/>
     </w:p>
     <w:p/>
+    <w:p/>
     <w:p>
       <w:pPr>
         <w:pStyle w:val="Cmsor2"/>
@@ -1872,12 +1873,13 @@
       <w:r>
         <w:t>Rendszerkövetelmények</w:t>
       </w:r>
-      <w:r>
-        <w:t>2</w:t>
-      </w:r>
       <w:bookmarkEnd w:id="5"/>
     </w:p>
-    <w:p/>
+    <w:p>
+      <w:r>
+        <w:t>Hogy az oldal működjön, el kell tudnia érni az adatbázist.</w:t>
+      </w:r>
+    </w:p>
     <w:p>
       <w:pPr>
         <w:spacing w:line="259" w:lineRule="auto"/>
@@ -2049,22 +2051,19 @@
     <w:p/>
     <w:p>
       <w:r>
-        <w:rPr>
-          <w:noProof/>
-        </w:rPr>
+        <w:t>A felületen jól láthatóan megjelenik a felhasználónév és a jelszó megadására szolgáló beviteli mező. Ezeket értelemszerűen akkor tudjuk kitölteni, ha már rendelkezünk regisztrált fiókkal az oldalon. Miután beírtuk a szükséges adatokat, a rendszer lehetőséget ad a bejelentkezésre, így hozzáférhetünk a személyes profilunkhoz és az oldal által kínált funkciókhoz. Ha még nincs fiókunk, általában találunk egy regisztrációs lehetőséget is, ahol könnyedén létrehozhatjuk azt.</w:t>
+      </w:r>
+      <w:r>
+        <w:t xml:space="preserve"> </w:t>
+      </w:r>
+    </w:p>
+    <w:p>
+      <w:r>
         <w:drawing>
-          <wp:anchor distT="0" distB="0" distL="114300" distR="114300" simplePos="0" relativeHeight="251678720" behindDoc="1" locked="0" layoutInCell="1" allowOverlap="1" wp14:anchorId="2600218C" wp14:editId="39F5B1DA">
-            <wp:simplePos x="0" y="0"/>
-            <wp:positionH relativeFrom="margin">
-              <wp:align>center</wp:align>
-            </wp:positionH>
-            <wp:positionV relativeFrom="paragraph">
-              <wp:posOffset>1086190</wp:posOffset>
-            </wp:positionV>
-            <wp:extent cx="4883785" cy="4093210"/>
-            <wp:effectExtent l="0" t="0" r="0" b="2540"/>
-            <wp:wrapTopAndBottom/>
-            <wp:docPr id="11" name="Kép 11"/>
+          <wp:inline distT="0" distB="0" distL="0" distR="0" wp14:anchorId="62052A92" wp14:editId="7B3F16F3">
+            <wp:extent cx="5087060" cy="5058481"/>
+            <wp:effectExtent l="0" t="0" r="0" b="8890"/>
+            <wp:docPr id="17" name="Kép 17"/>
             <wp:cNvGraphicFramePr>
               <a:graphicFrameLocks xmlns:a="http://schemas.openxmlformats.org/drawingml/2006/main" noChangeAspect="1"/>
             </wp:cNvGraphicFramePr>
@@ -2076,13 +2075,7 @@
                     <pic:cNvPicPr/>
                   </pic:nvPicPr>
                   <pic:blipFill>
-                    <a:blip r:embed="rId8">
-                      <a:extLst>
-                        <a:ext uri="{28A0092B-C50C-407E-A947-70E740481C1C}">
-                          <a14:useLocalDpi xmlns:a14="http://schemas.microsoft.com/office/drawing/2010/main" val="0"/>
-                        </a:ext>
-                      </a:extLst>
-                    </a:blip>
+                    <a:blip r:embed="rId8"/>
                     <a:stretch>
                       <a:fillRect/>
                     </a:stretch>
@@ -2090,32 +2083,17 @@
                   <pic:spPr>
                     <a:xfrm>
                       <a:off x="0" y="0"/>
-                      <a:ext cx="4883785" cy="4093210"/>
+                      <a:ext cx="5087060" cy="5058481"/>
                     </a:xfrm>
                     <a:prstGeom prst="rect">
                       <a:avLst/>
                     </a:prstGeom>
-                    <a:ln>
-                      <a:noFill/>
-                    </a:ln>
                   </pic:spPr>
                 </pic:pic>
               </a:graphicData>
             </a:graphic>
-            <wp14:sizeRelH relativeFrom="margin">
-              <wp14:pctWidth>0</wp14:pctWidth>
-            </wp14:sizeRelH>
-            <wp14:sizeRelV relativeFrom="margin">
-              <wp14:pctHeight>0</wp14:pctHeight>
-            </wp14:sizeRelV>
-          </wp:anchor>
+          </wp:inline>
         </w:drawing>
-      </w:r>
-      <w:r>
-        <w:t>A felületen jól láthatóan megjelenik a felhasználónév és a jelszó megadására szolgáló beviteli mező. Ezeket értelemszerűen akkor tudjuk kitölteni, ha már rendelkezünk regisztrált fiókkal az oldalon. Miután beírtuk a szükséges adatokat, a rendszer lehetőséget ad a bejelentkezésre, így hozzáférhetünk a személyes profilunkhoz és az oldal által kínált funkciókhoz. Ha még nincs fiókunk, általában találunk egy regisztrációs lehetőséget is, ahol könnyedén létrehozhatjuk azt.</w:t>
-      </w:r>
-      <w:r>
-        <w:t xml:space="preserve"> </w:t>
       </w:r>
     </w:p>
     <w:p>
@@ -2130,14 +2108,22 @@
       <w:bookmarkEnd w:id="8"/>
     </w:p>
     <w:p>
-      <w:r>
-        <w:t xml:space="preserve">A regisztrációs felületen találhatóak azok a beviteli mezők, amelyek segítségével új felhasználói fiókot hozhatunk létre az oldalon. Itt általában meg kell adnunk a kívánt felhasználónevet, a jelszót, valamint esetenként egyéb adatokat is, mint például az e-mail-cím vagy egy jelszó megerősítése mező. Miután minden szükséges információt kitöltöttünk, </w:t>
-      </w:r>
-      <w:r>
-        <w:rPr>
-          <w:noProof/>
-        </w:rPr>
+      <w:pPr>
+        <w:rPr>
+          <w:noProof/>
+        </w:rPr>
+      </w:pPr>
+      <w:r>
+        <w:t xml:space="preserve">A regisztrációs felületen találhatóak azok a beviteli mezők, amelyek segítségével új felhasználói fiókot hozhatunk létre az oldalon. Itt általában meg kell adnunk a kívánt </w:t>
+      </w:r>
+      <w:r>
         <w:lastRenderedPageBreak/>
+        <w:t xml:space="preserve">felhasználónevet, a jelszót, valamint esetenként egyéb adatokat is, mint például az e-mail-cím vagy egy jelszó megerősítése mező. Miután minden szükséges információt kitöltöttünk, </w:t>
+      </w:r>
+      <w:r>
+        <w:rPr>
+          <w:noProof/>
+        </w:rPr>
         <mc:AlternateContent>
           <mc:Choice Requires="wps">
             <w:drawing>
@@ -2266,25 +2252,25 @@
         </mc:AlternateContent>
       </w:r>
       <w:r>
-        <w:t xml:space="preserve">a regisztráció gomb megnyomásával véglegesíthetjük a folyamatot, és létrejön az új fiókunk, </w:t>
-      </w:r>
-      <w:r>
-        <w:rPr>
-          <w:noProof/>
-        </w:rPr>
+        <w:t>a regisztráció gomb megnyomásával véglegesíthetjük a folyamatot, és létrejön az új fiókunk, amellyel később be tudunk majd jelentkezni az oldalra.</w:t>
+      </w:r>
+      <w:r>
+        <w:rPr>
+          <w:noProof/>
+        </w:rPr>
+        <w:t xml:space="preserve"> </w:t>
+      </w:r>
+    </w:p>
+    <w:p>
+      <w:pPr>
+        <w:jc w:val="center"/>
+      </w:pPr>
+      <w:r>
         <w:drawing>
-          <wp:anchor distT="0" distB="0" distL="114300" distR="114300" simplePos="0" relativeHeight="251679744" behindDoc="0" locked="0" layoutInCell="1" allowOverlap="1" wp14:anchorId="46DD4C5E" wp14:editId="0FD7163A">
-            <wp:simplePos x="0" y="0"/>
-            <wp:positionH relativeFrom="page">
-              <wp:align>center</wp:align>
-            </wp:positionH>
-            <wp:positionV relativeFrom="paragraph">
-              <wp:posOffset>460375</wp:posOffset>
-            </wp:positionV>
-            <wp:extent cx="4731385" cy="4318000"/>
-            <wp:effectExtent l="0" t="0" r="0" b="6350"/>
-            <wp:wrapTopAndBottom/>
-            <wp:docPr id="12" name="Kép 12"/>
+          <wp:inline distT="0" distB="0" distL="0" distR="0" wp14:anchorId="2E21C075" wp14:editId="5DAC8C10">
+            <wp:extent cx="3672796" cy="5438692"/>
+            <wp:effectExtent l="0" t="0" r="4445" b="0"/>
+            <wp:docPr id="18" name="Kép 18"/>
             <wp:cNvGraphicFramePr>
               <a:graphicFrameLocks xmlns:a="http://schemas.openxmlformats.org/drawingml/2006/main" noChangeAspect="1"/>
             </wp:cNvGraphicFramePr>
@@ -2296,13 +2282,7 @@
                     <pic:cNvPicPr/>
                   </pic:nvPicPr>
                   <pic:blipFill>
-                    <a:blip r:embed="rId9">
-                      <a:extLst>
-                        <a:ext uri="{28A0092B-C50C-407E-A947-70E740481C1C}">
-                          <a14:useLocalDpi xmlns:a14="http://schemas.microsoft.com/office/drawing/2010/main" val="0"/>
-                        </a:ext>
-                      </a:extLst>
-                    </a:blip>
+                    <a:blip r:embed="rId9"/>
                     <a:stretch>
                       <a:fillRect/>
                     </a:stretch>
@@ -2310,7 +2290,7 @@
                   <pic:spPr>
                     <a:xfrm>
                       <a:off x="0" y="0"/>
-                      <a:ext cx="4731385" cy="4318000"/>
+                      <a:ext cx="3683532" cy="5454590"/>
                     </a:xfrm>
                     <a:prstGeom prst="rect">
                       <a:avLst/>
@@ -2319,23 +2299,8 @@
                 </pic:pic>
               </a:graphicData>
             </a:graphic>
-            <wp14:sizeRelH relativeFrom="margin">
-              <wp14:pctWidth>0</wp14:pctWidth>
-            </wp14:sizeRelH>
-            <wp14:sizeRelV relativeFrom="margin">
-              <wp14:pctHeight>0</wp14:pctHeight>
-            </wp14:sizeRelV>
-          </wp:anchor>
+          </wp:inline>
         </w:drawing>
-      </w:r>
-      <w:r>
-        <w:t>amellyel később be tudunk majd jelentkezni az oldalra.</w:t>
-      </w:r>
-      <w:r>
-        <w:rPr>
-          <w:noProof/>
-        </w:rPr>
-        <w:t xml:space="preserve"> </w:t>
       </w:r>
     </w:p>
     <w:p>
@@ -2345,22 +2310,21 @@
       </w:pPr>
       <w:bookmarkStart w:id="9" w:name="_Toc210292804"/>
       <w:r>
+        <w:lastRenderedPageBreak/>
+        <w:t>Főoldal</w:t>
+      </w:r>
+      <w:bookmarkEnd w:id="9"/>
+    </w:p>
+    <w:p>
+      <w:r>
         <w:rPr>
           <w:noProof/>
         </w:rPr>
         <w:drawing>
-          <wp:anchor distT="0" distB="0" distL="114300" distR="114300" simplePos="0" relativeHeight="251683840" behindDoc="0" locked="0" layoutInCell="1" allowOverlap="1" wp14:anchorId="4EA82204" wp14:editId="1CEA0F7F">
-            <wp:simplePos x="0" y="0"/>
-            <wp:positionH relativeFrom="margin">
-              <wp:align>left</wp:align>
-            </wp:positionH>
-            <wp:positionV relativeFrom="paragraph">
-              <wp:posOffset>4762500</wp:posOffset>
-            </wp:positionV>
-            <wp:extent cx="5391150" cy="3150870"/>
-            <wp:effectExtent l="0" t="0" r="0" b="0"/>
-            <wp:wrapTopAndBottom/>
-            <wp:docPr id="17" name="Kép 7"/>
+          <wp:inline distT="0" distB="0" distL="0" distR="0" wp14:anchorId="1B50B179" wp14:editId="21AF31C1">
+            <wp:extent cx="5273372" cy="3220917"/>
+            <wp:effectExtent l="38100" t="38100" r="41910" b="36830"/>
+            <wp:docPr id="16" name="Kép 2"/>
             <wp:cNvGraphicFramePr>
               <a:graphicFrameLocks xmlns:a="http://schemas.openxmlformats.org/drawingml/2006/main" noChangeAspect="1"/>
             </wp:cNvGraphicFramePr>
@@ -2368,7 +2332,7 @@
               <a:graphicData uri="http://schemas.openxmlformats.org/drawingml/2006/picture">
                 <pic:pic xmlns:pic="http://schemas.openxmlformats.org/drawingml/2006/picture">
                   <pic:nvPicPr>
-                    <pic:cNvPr id="8" name="Kép 7"/>
+                    <pic:cNvPr id="3" name="Kép 2"/>
                     <pic:cNvPicPr>
                       <a:picLocks noChangeAspect="1"/>
                     </pic:cNvPicPr>
@@ -2388,37 +2352,26 @@
                   <pic:spPr>
                     <a:xfrm>
                       <a:off x="0" y="0"/>
-                      <a:ext cx="5391150" cy="3150870"/>
+                      <a:ext cx="5278422" cy="3224002"/>
                     </a:xfrm>
                     <a:prstGeom prst="rect">
                       <a:avLst/>
                     </a:prstGeom>
-                    <a:solidFill>
-                      <a:schemeClr val="accent1">
-                        <a:lumMod val="40000"/>
-                        <a:lumOff val="60000"/>
-                      </a:schemeClr>
-                    </a:solidFill>
                     <a:ln w="38100">
-                      <a:noFill/>
+                      <a:solidFill>
+                        <a:schemeClr val="accent1">
+                          <a:lumMod val="40000"/>
+                          <a:lumOff val="60000"/>
+                        </a:schemeClr>
+                      </a:solidFill>
                     </a:ln>
                   </pic:spPr>
                 </pic:pic>
               </a:graphicData>
             </a:graphic>
-            <wp14:sizeRelH relativeFrom="margin">
-              <wp14:pctWidth>0</wp14:pctWidth>
-            </wp14:sizeRelH>
-            <wp14:sizeRelV relativeFrom="margin">
-              <wp14:pctHeight>0</wp14:pctHeight>
-            </wp14:sizeRelV>
-          </wp:anchor>
+          </wp:inline>
         </w:drawing>
       </w:r>
-      <w:r>
-        <w:t>Főoldal</w:t>
-      </w:r>
-      <w:bookmarkEnd w:id="9"/>
     </w:p>
     <w:p>
       <w:r>
@@ -2445,7 +2398,6 @@
     </w:p>
     <w:p>
       <w:r>
-        <w:lastRenderedPageBreak/>
         <w:t xml:space="preserve">A főoldal letisztult, egyszerű színekkel jelenik meg a felhasználó elött. Címsorban található a Főoldal, Menük, Bejelentkezés és Regisztráció gomb, amikkel a felhasználó tud interakcióba lépni. Az oldal alján a szürke mezőben található meg a támogatások és a „Rólunk” gomb, ami lecseréli az üdvözlő szöveget egy leírásra rólunk és maga a Dózsa Csárda weboldalról. Könnyen vissza lehet lépni a balra mutató nyílra, ezzel vissza térve az üdvözlő főoldalra. </w:t>
       </w:r>
     </w:p>
@@ -2464,11 +2416,11 @@
         <w:br w:type="page"/>
       </w:r>
     </w:p>
+    <w:bookmarkStart w:id="10" w:name="_Toc210292805"/>
     <w:p>
       <w:pPr>
         <w:pStyle w:val="Cmsor1"/>
       </w:pPr>
-      <w:bookmarkStart w:id="10" w:name="_Toc210292805"/>
       <w:r>
         <w:rPr>
           <w:noProof/>
@@ -2606,6 +2558,114 @@
       </w:r>
       <w:bookmarkEnd w:id="10"/>
     </w:p>
+    <w:p>
+      <w:pPr>
+        <w:rPr>
+          <w:b/>
+          <w:bCs/>
+          <w:u w:val="single"/>
+        </w:rPr>
+      </w:pPr>
+      <w:r>
+        <w:rPr>
+          <w:b/>
+          <w:bCs/>
+          <w:u w:val="single"/>
+        </w:rPr>
+        <w:t>Fiók készítése</w:t>
+      </w:r>
+    </w:p>
+    <w:p>
+      <w:r>
+        <w:t xml:space="preserve">Hogy az oldalt használni lehessen, a felhasználónak készítenie kell egy fiókot, regisztrálnia kell az oldalra, abban az esetben, ha </w:t>
+      </w:r>
+      <w:r>
+        <w:t>még nincsen beregisztrált fiókja</w:t>
+      </w:r>
+      <w:r>
+        <w:t xml:space="preserve">. Ezt </w:t>
+      </w:r>
+      <w:r>
+        <w:t>egy felhasználónév, egy lakcím, egy email és a jelszó megadásával lehet megtenni. A jelszót, nem tároljuk le nyers szövegként, hanem egy úgynevezett HASH kódot generálunk, melyet mi sem tudunk visszafejteni, ez az adatvédelem érdekében van</w:t>
+      </w:r>
+      <w:r>
+        <w:t xml:space="preserve">. Ha van, illetve ha regisztrált az oldalra, akkor be kell jelentkeznie, a felhasználónév, és a </w:t>
+      </w:r>
+      <w:r>
+        <w:t>jelszó megadásával teheti meg.</w:t>
+      </w:r>
+    </w:p>
+    <w:p>
+      <w:r>
+        <w:t xml:space="preserve">Sikeres bejelentkezés esetén, az oldal a saját profilra fogja átírányítani, ahonnan vissza lehet menni a főoldalra. </w:t>
+      </w:r>
+    </w:p>
+    <w:p/>
+    <w:p>
+      <w:pPr>
+        <w:rPr>
+          <w:b/>
+          <w:bCs/>
+          <w:u w:val="single"/>
+        </w:rPr>
+      </w:pPr>
+      <w:r>
+        <w:rPr>
+          <w:b/>
+          <w:bCs/>
+          <w:u w:val="single"/>
+        </w:rPr>
+        <w:t>Rendelés</w:t>
+      </w:r>
+    </w:p>
+    <w:p>
+      <w:r>
+        <w:t>A főoldalon, a menük</w:t>
+      </w:r>
+      <w:r>
+        <w:t xml:space="preserve"> gombra kattintva, meg fog jelenni egy kisebb ablak, úgynevezett pop-up window, amely tartalmazza az 5 kategóriát, a kosarat, a rendelés gombot, és minden szükséges dolgot egy rendelés lebonoylításához.</w:t>
+      </w:r>
+    </w:p>
+    <w:p>
+      <w:r>
+        <w:t>Amennyiben leadtuk a rendelést, és visszajelzést kaptunk, hogy a rendelés le lett adva, a profilon, meg lehet nézni, hogy mit is rendeltünk, illetve megmásítani is meg lehet, ha valamiről megondoltuk magunkat.</w:t>
+      </w:r>
+    </w:p>
+    <w:p/>
+    <w:p>
+      <w:pPr>
+        <w:rPr>
+          <w:b/>
+          <w:bCs/>
+          <w:u w:val="single"/>
+        </w:rPr>
+      </w:pPr>
+      <w:r>
+        <w:rPr>
+          <w:b/>
+          <w:bCs/>
+          <w:u w:val="single"/>
+        </w:rPr>
+        <w:t>Fiók Törlése</w:t>
+      </w:r>
+    </w:p>
+    <w:p>
+      <w:pPr>
+        <w:rPr>
+          <w:b/>
+          <w:bCs/>
+          <w:u w:val="single"/>
+        </w:rPr>
+      </w:pPr>
+    </w:p>
+    <w:p>
+      <w:r>
+        <w:t xml:space="preserve">Ha úgy ítéljük meg, hogy nem szeretnék tovább használni a Dózsa Csárda oldalt, vagy elégedetlenek vagyunk a szolgáltatással, </w:t>
+      </w:r>
+      <w:r>
+        <w:t>akkor a profil oldalon, a fiók törlése gombra kattintva, eltávolíthatjuk magunkat a rendszerből, de ha véletlenül, megint megondoljuk magunkat, a regisztrációval újra létrehozhatjuk egy fiókot.</w:t>
+      </w:r>
+    </w:p>
     <w:p/>
     <w:p>
       <w:pPr>
@@ -2764,7 +2824,59 @@
       </w:r>
       <w:bookmarkEnd w:id="11"/>
     </w:p>
+    <w:p>
+      <w:pPr>
+        <w:rPr>
+          <w:b/>
+          <w:bCs/>
+          <w:u w:val="single"/>
+        </w:rPr>
+      </w:pPr>
+      <w:r>
+        <w:rPr>
+          <w:b/>
+          <w:bCs/>
+          <w:u w:val="single"/>
+        </w:rPr>
+        <w:t>Backend Hibakezelés</w:t>
+      </w:r>
+    </w:p>
+    <w:p>
+      <w:r>
+        <w:t xml:space="preserve">Ha a Backend szerver nem képes kapcsolódni, az adatbázis szerverhez, akkor nem fagy le a program, hanem szimplán nem lesznek elérhetőek azok a szolgáltatások, amelyekhez az adatbázis szükséges. </w:t>
+      </w:r>
+    </w:p>
+    <w:p>
+      <w:r>
+        <w:t>Ilyenkor a frontenden, a rendelésnél például, egy olyan üzenet jelenik meg, hogy kapcsolódási hiba a szerverrel.</w:t>
+      </w:r>
+    </w:p>
     <w:p/>
+    <w:p>
+      <w:pPr>
+        <w:rPr>
+          <w:b/>
+          <w:bCs/>
+          <w:u w:val="single"/>
+        </w:rPr>
+      </w:pPr>
+      <w:r>
+        <w:rPr>
+          <w:b/>
+          <w:bCs/>
+          <w:u w:val="single"/>
+        </w:rPr>
+        <w:t>Hibakezelés/Tesztelés</w:t>
+      </w:r>
+    </w:p>
+    <w:p>
+      <w:r>
+        <w:t xml:space="preserve">A Hibakezelési módszereket, a manuális tesztek, a végfelhasználó/fejlesztők által, illetve az egységtesztek (Unit Teszt) segítségével próbáltuk </w:t>
+      </w:r>
+      <w:r>
+        <w:t>megoldani.</w:t>
+      </w:r>
+    </w:p>
     <w:p>
       <w:pPr>
         <w:spacing w:line="259" w:lineRule="auto"/>
@@ -4076,6 +4188,7 @@
   <w:style w:type="character" w:default="1" w:styleId="Bekezdsalapbettpusa">
     <w:name w:val="Default Paragraph Font"/>
     <w:uiPriority w:val="1"/>
+    <w:semiHidden/>
     <w:unhideWhenUsed/>
   </w:style>
   <w:style w:type="table" w:default="1" w:styleId="Normltblzat">

</xml_diff>